<commit_message>
docs: add missing git tags (v0.8.1–v1.1.0), update tagging strategy in spec
- Created 8 annotated tags: v0.8.1, v0.9.0, v0.11.0, v0.12.0, v0.13.0, v1.0.0, v1.0.1, v1.1.0
- All 17 version tags now pushed to GitHub (v0.1.0 through v1.1.0)
- Updated spec generator tagging strategy reference
</commit_message>
<xml_diff>
--- a/docs/Thina_CRM_System_Specification_v1.1.0.docx
+++ b/docs/Thina_CRM_System_Specification_v1.1.0.docx
@@ -21259,7 +21259,7 @@
                 <w:sz w:val="20"/>
                 <w:szCs w:val="20"/>
               </w:rPr>
-              <w:t xml:space="preserve">Semantic version tags (v0.1.0 through v0.11.0)</w:t>
+              <w:t xml:space="preserve">Semantic version tags (v0.1.0 through v1.1.0) — annotated tags on every release</w:t>
             </w:r>
           </w:p>
         </w:tc>
@@ -25383,7 +25383,7 @@
           <w:sz w:val="22"/>
           <w:szCs w:val="22"/>
         </w:rPr>
-        <w:t xml:space="preserve">Created semantic version tags (v0.1.0 through v0.11.0) at each milestone</w:t>
+        <w:t xml:space="preserve">Created semantic version tags (v0.1.0 through v1.1.0) at each milestone — 17 annotated tags</w:t>
       </w:r>
     </w:p>
     <w:p>

</xml_diff>